<commit_message>
Populate the table of contents in the D6 final report
The report's TOC was an empty Word field that only filled in after a
manual "Update Field" in Word, so it showed as blank in any other viewer.
It now contains all 19 Heading 1/Heading 2 entries with dot leaders,
clickable links to bookmarked headings, and page numbers taken from a
render of the document. The TOC still fits on page 2 and the report is
still 11 pages.

The "Table of Contents" title now uses a TOC Heading style (same look,
not an outline level), so it no longer lists itself when Word refreshes
the field.

Co-Authored-By: Claude Opus 5.5 <noreply@anthropic.com>
Claude-Session: https://claude.ai/code/session_01Ae7GFufZcC1fFQLcjKeCLN
</commit_message>
<xml_diff>
--- a/docs/ABDURRAHMAAN_IT401_DEL_6_FINAL_REPORT.docx
+++ b/docs/ABDURRAHMAAN_IT401_DEL_6_FINAL_REPORT.docx
@@ -117,7 +117,7 @@
     </w:p>
     <w:p>
       <w:pPr>
-        <w:pStyle w:val="Heading1"/>
+        <w:pStyle w:val="TOCHeading"/>
         <w:spacing w:after="200" w:before="400"/>
       </w:pPr>
       <w:r>
@@ -134,14 +134,552 @@
     <w:sdt>
       <w:sdtPr>
         <w:alias w:val="Table of Contents"/>
+        <w:docPartObj>
+          <w:docPartGallery w:val="Table of Contents"/>
+          <w:docPartUnique/>
+        </w:docPartObj>
       </w:sdtPr>
       <w:sdtContent>
         <w:p>
+          <w:pPr>
+            <w:pStyle w:val="TOC1"/>
+          </w:pPr>
           <w:r>
-            <w:fldChar w:fldCharType="begin" w:dirty="true"/>
-            <w:instrText xml:space="preserve">TOC \h \o "1-3"</w:instrText>
+            <w:fldChar w:fldCharType="begin"/>
+          </w:r>
+          <w:r>
+            <w:instrText xml:space="preserve"> TOC \o "1-3" \h \z \u </w:instrText>
+          </w:r>
+          <w:r>
             <w:fldChar w:fldCharType="separate"/>
           </w:r>
+          <w:hyperlink w:anchor="_Toc90000001" w:history="1">
+            <w:r>
+              <w:t xml:space="preserve">1. Executive Summary</w:t>
+            </w:r>
+            <w:r>
+              <w:tab/>
+            </w:r>
+            <w:r>
+              <w:fldChar w:fldCharType="begin"/>
+            </w:r>
+            <w:r>
+              <w:instrText xml:space="preserve"> PAGEREF _Toc90000001 \h </w:instrText>
+            </w:r>
+            <w:r>
+              <w:fldChar w:fldCharType="separate"/>
+            </w:r>
+            <w:r>
+              <w:t>3</w:t>
+            </w:r>
+            <w:r>
+              <w:fldChar w:fldCharType="end"/>
+            </w:r>
+          </w:hyperlink>
+        </w:p>
+        <w:p>
+          <w:pPr>
+            <w:pStyle w:val="TOC1"/>
+          </w:pPr>
+          <w:hyperlink w:anchor="_Toc90000002" w:history="1">
+            <w:r>
+              <w:t xml:space="preserve">2. Project Overview &amp; Objectives</w:t>
+            </w:r>
+            <w:r>
+              <w:tab/>
+            </w:r>
+            <w:r>
+              <w:fldChar w:fldCharType="begin"/>
+            </w:r>
+            <w:r>
+              <w:instrText xml:space="preserve"> PAGEREF _Toc90000002 \h </w:instrText>
+            </w:r>
+            <w:r>
+              <w:fldChar w:fldCharType="separate"/>
+            </w:r>
+            <w:r>
+              <w:t>3</w:t>
+            </w:r>
+            <w:r>
+              <w:fldChar w:fldCharType="end"/>
+            </w:r>
+          </w:hyperlink>
+        </w:p>
+        <w:p>
+          <w:pPr>
+            <w:pStyle w:val="TOC2"/>
+          </w:pPr>
+          <w:hyperlink w:anchor="_Toc90000003" w:history="1">
+            <w:r>
+              <w:t xml:space="preserve">2.1 Objectives</w:t>
+            </w:r>
+            <w:r>
+              <w:tab/>
+            </w:r>
+            <w:r>
+              <w:fldChar w:fldCharType="begin"/>
+            </w:r>
+            <w:r>
+              <w:instrText xml:space="preserve"> PAGEREF _Toc90000003 \h </w:instrText>
+            </w:r>
+            <w:r>
+              <w:fldChar w:fldCharType="separate"/>
+            </w:r>
+            <w:r>
+              <w:t>3</w:t>
+            </w:r>
+            <w:r>
+              <w:fldChar w:fldCharType="end"/>
+            </w:r>
+          </w:hyperlink>
+        </w:p>
+        <w:p>
+          <w:pPr>
+            <w:pStyle w:val="TOC1"/>
+          </w:pPr>
+          <w:hyperlink w:anchor="_Toc90000004" w:history="1">
+            <w:r>
+              <w:t xml:space="preserve">3. Deliverables Summary</w:t>
+            </w:r>
+            <w:r>
+              <w:tab/>
+            </w:r>
+            <w:r>
+              <w:fldChar w:fldCharType="begin"/>
+            </w:r>
+            <w:r>
+              <w:instrText xml:space="preserve"> PAGEREF _Toc90000004 \h </w:instrText>
+            </w:r>
+            <w:r>
+              <w:fldChar w:fldCharType="separate"/>
+            </w:r>
+            <w:r>
+              <w:t>4</w:t>
+            </w:r>
+            <w:r>
+              <w:fldChar w:fldCharType="end"/>
+            </w:r>
+          </w:hyperlink>
+        </w:p>
+        <w:p>
+          <w:pPr>
+            <w:pStyle w:val="TOC2"/>
+          </w:pPr>
+          <w:hyperlink w:anchor="_Toc90000005" w:history="1">
+            <w:r>
+              <w:t xml:space="preserve">3.1 Deliverable 3 — Working Prototype</w:t>
+            </w:r>
+            <w:r>
+              <w:tab/>
+            </w:r>
+            <w:r>
+              <w:fldChar w:fldCharType="begin"/>
+            </w:r>
+            <w:r>
+              <w:instrText xml:space="preserve"> PAGEREF _Toc90000005 \h </w:instrText>
+            </w:r>
+            <w:r>
+              <w:fldChar w:fldCharType="separate"/>
+            </w:r>
+            <w:r>
+              <w:t>4</w:t>
+            </w:r>
+            <w:r>
+              <w:fldChar w:fldCharType="end"/>
+            </w:r>
+          </w:hyperlink>
+        </w:p>
+        <w:p>
+          <w:pPr>
+            <w:pStyle w:val="TOC2"/>
+          </w:pPr>
+          <w:hyperlink w:anchor="_Toc90000006" w:history="1">
+            <w:r>
+              <w:t xml:space="preserve">3.2 Deliverable 4 — Complete Project Report</w:t>
+            </w:r>
+            <w:r>
+              <w:tab/>
+            </w:r>
+            <w:r>
+              <w:fldChar w:fldCharType="begin"/>
+            </w:r>
+            <w:r>
+              <w:instrText xml:space="preserve"> PAGEREF _Toc90000006 \h </w:instrText>
+            </w:r>
+            <w:r>
+              <w:fldChar w:fldCharType="separate"/>
+            </w:r>
+            <w:r>
+              <w:t>5</w:t>
+            </w:r>
+            <w:r>
+              <w:fldChar w:fldCharType="end"/>
+            </w:r>
+          </w:hyperlink>
+        </w:p>
+        <w:p>
+          <w:pPr>
+            <w:pStyle w:val="TOC2"/>
+          </w:pPr>
+          <w:hyperlink w:anchor="_Toc90000007" w:history="1">
+            <w:r>
+              <w:t xml:space="preserve">3.3 Deliverable 5 — 100% Feature Completion</w:t>
+            </w:r>
+            <w:r>
+              <w:tab/>
+            </w:r>
+            <w:r>
+              <w:fldChar w:fldCharType="begin"/>
+            </w:r>
+            <w:r>
+              <w:instrText xml:space="preserve"> PAGEREF _Toc90000007 \h </w:instrText>
+            </w:r>
+            <w:r>
+              <w:fldChar w:fldCharType="separate"/>
+            </w:r>
+            <w:r>
+              <w:t>5</w:t>
+            </w:r>
+            <w:r>
+              <w:fldChar w:fldCharType="end"/>
+            </w:r>
+          </w:hyperlink>
+        </w:p>
+        <w:p>
+          <w:pPr>
+            <w:pStyle w:val="TOC2"/>
+          </w:pPr>
+          <w:hyperlink w:anchor="_Toc90000008" w:history="1">
+            <w:r>
+              <w:t xml:space="preserve">3.4 Extended Scope — The Billing Engine</w:t>
+            </w:r>
+            <w:r>
+              <w:tab/>
+            </w:r>
+            <w:r>
+              <w:fldChar w:fldCharType="begin"/>
+            </w:r>
+            <w:r>
+              <w:instrText xml:space="preserve"> PAGEREF _Toc90000008 \h </w:instrText>
+            </w:r>
+            <w:r>
+              <w:fldChar w:fldCharType="separate"/>
+            </w:r>
+            <w:r>
+              <w:t>5</w:t>
+            </w:r>
+            <w:r>
+              <w:fldChar w:fldCharType="end"/>
+            </w:r>
+          </w:hyperlink>
+        </w:p>
+        <w:p>
+          <w:pPr>
+            <w:pStyle w:val="TOC1"/>
+          </w:pPr>
+          <w:hyperlink w:anchor="_Toc90000009" w:history="1">
+            <w:r>
+              <w:t xml:space="preserve">4. System Architecture Summary</w:t>
+            </w:r>
+            <w:r>
+              <w:tab/>
+            </w:r>
+            <w:r>
+              <w:fldChar w:fldCharType="begin"/>
+            </w:r>
+            <w:r>
+              <w:instrText xml:space="preserve"> PAGEREF _Toc90000009 \h </w:instrText>
+            </w:r>
+            <w:r>
+              <w:fldChar w:fldCharType="separate"/>
+            </w:r>
+            <w:r>
+              <w:t>6</w:t>
+            </w:r>
+            <w:r>
+              <w:fldChar w:fldCharType="end"/>
+            </w:r>
+          </w:hyperlink>
+        </w:p>
+        <w:p>
+          <w:pPr>
+            <w:pStyle w:val="TOC1"/>
+          </w:pPr>
+          <w:hyperlink w:anchor="_Toc90000010" w:history="1">
+            <w:r>
+              <w:t xml:space="preserve">5. Key Features Delivered</w:t>
+            </w:r>
+            <w:r>
+              <w:tab/>
+            </w:r>
+            <w:r>
+              <w:fldChar w:fldCharType="begin"/>
+            </w:r>
+            <w:r>
+              <w:instrText xml:space="preserve"> PAGEREF _Toc90000010 \h </w:instrText>
+            </w:r>
+            <w:r>
+              <w:fldChar w:fldCharType="separate"/>
+            </w:r>
+            <w:r>
+              <w:t>7</w:t>
+            </w:r>
+            <w:r>
+              <w:fldChar w:fldCharType="end"/>
+            </w:r>
+          </w:hyperlink>
+        </w:p>
+        <w:p>
+          <w:pPr>
+            <w:pStyle w:val="TOC2"/>
+          </w:pPr>
+          <w:hyperlink w:anchor="_Toc90000011" w:history="1">
+            <w:r>
+              <w:t xml:space="preserve">5.1 By Role</w:t>
+            </w:r>
+            <w:r>
+              <w:tab/>
+            </w:r>
+            <w:r>
+              <w:fldChar w:fldCharType="begin"/>
+            </w:r>
+            <w:r>
+              <w:instrText xml:space="preserve"> PAGEREF _Toc90000011 \h </w:instrText>
+            </w:r>
+            <w:r>
+              <w:fldChar w:fldCharType="separate"/>
+            </w:r>
+            <w:r>
+              <w:t>7</w:t>
+            </w:r>
+            <w:r>
+              <w:fldChar w:fldCharType="end"/>
+            </w:r>
+          </w:hyperlink>
+        </w:p>
+        <w:p>
+          <w:pPr>
+            <w:pStyle w:val="TOC2"/>
+          </w:pPr>
+          <w:hyperlink w:anchor="_Toc90000012" w:history="1">
+            <w:r>
+              <w:t xml:space="preserve">5.2 Deliverable 5 Highlights</w:t>
+            </w:r>
+            <w:r>
+              <w:tab/>
+            </w:r>
+            <w:r>
+              <w:fldChar w:fldCharType="begin"/>
+            </w:r>
+            <w:r>
+              <w:instrText xml:space="preserve"> PAGEREF _Toc90000012 \h </w:instrText>
+            </w:r>
+            <w:r>
+              <w:fldChar w:fldCharType="separate"/>
+            </w:r>
+            <w:r>
+              <w:t>7</w:t>
+            </w:r>
+            <w:r>
+              <w:fldChar w:fldCharType="end"/>
+            </w:r>
+          </w:hyperlink>
+        </w:p>
+        <w:p>
+          <w:pPr>
+            <w:pStyle w:val="TOC2"/>
+          </w:pPr>
+          <w:hyperlink w:anchor="_Toc90000013" w:history="1">
+            <w:r>
+              <w:t xml:space="preserve">5.3 Billing Engine Highlights</w:t>
+            </w:r>
+            <w:r>
+              <w:tab/>
+            </w:r>
+            <w:r>
+              <w:fldChar w:fldCharType="begin"/>
+            </w:r>
+            <w:r>
+              <w:instrText xml:space="preserve"> PAGEREF _Toc90000013 \h </w:instrText>
+            </w:r>
+            <w:r>
+              <w:fldChar w:fldCharType="separate"/>
+            </w:r>
+            <w:r>
+              <w:t>7</w:t>
+            </w:r>
+            <w:r>
+              <w:fldChar w:fldCharType="end"/>
+            </w:r>
+          </w:hyperlink>
+        </w:p>
+        <w:p>
+          <w:pPr>
+            <w:pStyle w:val="TOC1"/>
+          </w:pPr>
+          <w:hyperlink w:anchor="_Toc90000014" w:history="1">
+            <w:r>
+              <w:t xml:space="preserve">6. Testing &amp; Quality Assurance Results</w:t>
+            </w:r>
+            <w:r>
+              <w:tab/>
+            </w:r>
+            <w:r>
+              <w:fldChar w:fldCharType="begin"/>
+            </w:r>
+            <w:r>
+              <w:instrText xml:space="preserve"> PAGEREF _Toc90000014 \h </w:instrText>
+            </w:r>
+            <w:r>
+              <w:fldChar w:fldCharType="separate"/>
+            </w:r>
+            <w:r>
+              <w:t>7</w:t>
+            </w:r>
+            <w:r>
+              <w:fldChar w:fldCharType="end"/>
+            </w:r>
+          </w:hyperlink>
+        </w:p>
+        <w:p>
+          <w:pPr>
+            <w:pStyle w:val="TOC2"/>
+          </w:pPr>
+          <w:hyperlink w:anchor="_Toc90000015" w:history="1">
+            <w:r>
+              <w:t xml:space="preserve">6.1 What the Suite Verifies</w:t>
+            </w:r>
+            <w:r>
+              <w:tab/>
+            </w:r>
+            <w:r>
+              <w:fldChar w:fldCharType="begin"/>
+            </w:r>
+            <w:r>
+              <w:instrText xml:space="preserve"> PAGEREF _Toc90000015 \h </w:instrText>
+            </w:r>
+            <w:r>
+              <w:fldChar w:fldCharType="separate"/>
+            </w:r>
+            <w:r>
+              <w:t>8</w:t>
+            </w:r>
+            <w:r>
+              <w:fldChar w:fldCharType="end"/>
+            </w:r>
+          </w:hyperlink>
+        </w:p>
+        <w:p>
+          <w:pPr>
+            <w:pStyle w:val="TOC1"/>
+          </w:pPr>
+          <w:hyperlink w:anchor="_Toc90000016" w:history="1">
+            <w:r>
+              <w:t xml:space="preserve">7. Challenges &amp; Lessons Learned</w:t>
+            </w:r>
+            <w:r>
+              <w:tab/>
+            </w:r>
+            <w:r>
+              <w:fldChar w:fldCharType="begin"/>
+            </w:r>
+            <w:r>
+              <w:instrText xml:space="preserve"> PAGEREF _Toc90000016 \h </w:instrText>
+            </w:r>
+            <w:r>
+              <w:fldChar w:fldCharType="separate"/>
+            </w:r>
+            <w:r>
+              <w:t>8</w:t>
+            </w:r>
+            <w:r>
+              <w:fldChar w:fldCharType="end"/>
+            </w:r>
+          </w:hyperlink>
+        </w:p>
+        <w:p>
+          <w:pPr>
+            <w:pStyle w:val="TOC1"/>
+          </w:pPr>
+          <w:hyperlink w:anchor="_Toc90000017" w:history="1">
+            <w:r>
+              <w:t xml:space="preserve">8. Conclusion &amp; Recommendations for Future Work</w:t>
+            </w:r>
+            <w:r>
+              <w:tab/>
+            </w:r>
+            <w:r>
+              <w:fldChar w:fldCharType="begin"/>
+            </w:r>
+            <w:r>
+              <w:instrText xml:space="preserve"> PAGEREF _Toc90000017 \h </w:instrText>
+            </w:r>
+            <w:r>
+              <w:fldChar w:fldCharType="separate"/>
+            </w:r>
+            <w:r>
+              <w:t>9</w:t>
+            </w:r>
+            <w:r>
+              <w:fldChar w:fldCharType="end"/>
+            </w:r>
+          </w:hyperlink>
+        </w:p>
+        <w:p>
+          <w:pPr>
+            <w:pStyle w:val="TOC2"/>
+          </w:pPr>
+          <w:hyperlink w:anchor="_Toc90000018" w:history="1">
+            <w:r>
+              <w:t xml:space="preserve">8.1 Recommendations for IT402 (Capstone Part 2)</w:t>
+            </w:r>
+            <w:r>
+              <w:tab/>
+            </w:r>
+            <w:r>
+              <w:fldChar w:fldCharType="begin"/>
+            </w:r>
+            <w:r>
+              <w:instrText xml:space="preserve"> PAGEREF _Toc90000018 \h </w:instrText>
+            </w:r>
+            <w:r>
+              <w:fldChar w:fldCharType="separate"/>
+            </w:r>
+            <w:r>
+              <w:t>9</w:t>
+            </w:r>
+            <w:r>
+              <w:fldChar w:fldCharType="end"/>
+            </w:r>
+          </w:hyperlink>
+        </w:p>
+        <w:p>
+          <w:pPr>
+            <w:pStyle w:val="TOC1"/>
+          </w:pPr>
+          <w:hyperlink w:anchor="_Toc90000019" w:history="1">
+            <w:r>
+              <w:t xml:space="preserve">Appendix: Project Statistics Summary</w:t>
+            </w:r>
+            <w:r>
+              <w:tab/>
+            </w:r>
+            <w:r>
+              <w:fldChar w:fldCharType="begin"/>
+            </w:r>
+            <w:r>
+              <w:instrText xml:space="preserve"> PAGEREF _Toc90000019 \h </w:instrText>
+            </w:r>
+            <w:r>
+              <w:fldChar w:fldCharType="separate"/>
+            </w:r>
+            <w:r>
+              <w:t>11</w:t>
+            </w:r>
+            <w:r>
+              <w:fldChar w:fldCharType="end"/>
+            </w:r>
+          </w:hyperlink>
         </w:p>
         <w:p>
           <w:r>
@@ -160,6 +698,7 @@
         <w:pStyle w:val="Heading1"/>
         <w:spacing w:after="200" w:before="400"/>
       </w:pPr>
+      <w:bookmarkStart w:id="900" w:name="_Toc90000001"/>
       <w:r>
         <w:rPr>
           <w:b/>
@@ -170,6 +709,7 @@
         </w:rPr>
         <w:t xml:space="preserve">1. Executive Summary</w:t>
       </w:r>
+      <w:bookmarkEnd w:id="900"/>
     </w:p>
     <w:p>
       <w:pPr>
@@ -215,6 +755,7 @@
         <w:pStyle w:val="Heading1"/>
         <w:spacing w:after="200" w:before="400"/>
       </w:pPr>
+      <w:bookmarkStart w:id="901" w:name="_Toc90000002"/>
       <w:r>
         <w:rPr>
           <w:b/>
@@ -225,6 +766,7 @@
         </w:rPr>
         <w:t xml:space="preserve">2. Project Overview &amp; Objectives</w:t>
       </w:r>
+      <w:bookmarkEnd w:id="901"/>
     </w:p>
     <w:p>
       <w:pPr>
@@ -244,6 +786,7 @@
         <w:pStyle w:val="Heading2"/>
         <w:spacing w:after="150" w:before="300"/>
       </w:pPr>
+      <w:bookmarkStart w:id="902" w:name="_Toc90000003"/>
       <w:r>
         <w:rPr>
           <w:b/>
@@ -254,6 +797,7 @@
         </w:rPr>
         <w:t xml:space="preserve">2.1 Objectives</w:t>
       </w:r>
+      <w:bookmarkEnd w:id="902"/>
     </w:p>
     <w:p>
       <w:pPr>
@@ -400,6 +944,7 @@
         <w:pStyle w:val="Heading1"/>
         <w:spacing w:after="200" w:before="400"/>
       </w:pPr>
+      <w:bookmarkStart w:id="903" w:name="_Toc90000004"/>
       <w:r>
         <w:rPr>
           <w:b/>
@@ -410,6 +955,7 @@
         </w:rPr>
         <w:t xml:space="preserve">3. Deliverables Summary</w:t>
       </w:r>
+      <w:bookmarkEnd w:id="903"/>
     </w:p>
     <w:p>
       <w:pPr>
@@ -1114,6 +1660,7 @@
         <w:pStyle w:val="Heading2"/>
         <w:spacing w:after="150" w:before="300"/>
       </w:pPr>
+      <w:bookmarkStart w:id="904" w:name="_Toc90000005"/>
       <w:r>
         <w:rPr>
           <w:b/>
@@ -1124,6 +1671,7 @@
         </w:rPr>
         <w:t xml:space="preserve">3.1 Deliverable 3 — Working Prototype</w:t>
       </w:r>
+      <w:bookmarkEnd w:id="904"/>
     </w:p>
     <w:p>
       <w:pPr>
@@ -1143,6 +1691,7 @@
         <w:pStyle w:val="Heading2"/>
         <w:spacing w:after="150" w:before="300"/>
       </w:pPr>
+      <w:bookmarkStart w:id="905" w:name="_Toc90000006"/>
       <w:r>
         <w:rPr>
           <w:b/>
@@ -1153,6 +1702,7 @@
         </w:rPr>
         <w:t xml:space="preserve">3.2 Deliverable 4 — Complete Project Report</w:t>
       </w:r>
+      <w:bookmarkEnd w:id="905"/>
     </w:p>
     <w:p>
       <w:pPr>
@@ -1172,6 +1722,7 @@
         <w:pStyle w:val="Heading2"/>
         <w:spacing w:after="150" w:before="300"/>
       </w:pPr>
+      <w:bookmarkStart w:id="906" w:name="_Toc90000007"/>
       <w:r>
         <w:rPr>
           <w:b/>
@@ -1182,6 +1733,7 @@
         </w:rPr>
         <w:t xml:space="preserve">3.3 Deliverable 5 — 100% Feature Completion</w:t>
       </w:r>
+      <w:bookmarkEnd w:id="906"/>
     </w:p>
     <w:p>
       <w:pPr>
@@ -1345,6 +1897,7 @@
         <w:pStyle w:val="Heading2"/>
         <w:spacing w:after="150" w:before="300"/>
       </w:pPr>
+      <w:bookmarkStart w:id="907" w:name="_Toc90000008"/>
       <w:r>
         <w:rPr>
           <w:b/>
@@ -1355,6 +1908,7 @@
         </w:rPr>
         <w:t xml:space="preserve">3.4 Extended Scope — The Billing Engine</w:t>
       </w:r>
+      <w:bookmarkEnd w:id="907"/>
     </w:p>
     <w:p>
       <w:pPr>
@@ -1518,6 +2072,7 @@
         <w:pStyle w:val="Heading1"/>
         <w:spacing w:after="200" w:before="400"/>
       </w:pPr>
+      <w:bookmarkStart w:id="908" w:name="_Toc90000009"/>
       <w:r>
         <w:rPr>
           <w:b/>
@@ -1528,6 +2083,7 @@
         </w:rPr>
         <w:t xml:space="preserve">4. System Architecture Summary</w:t>
       </w:r>
+      <w:bookmarkEnd w:id="908"/>
     </w:p>
     <w:p>
       <w:pPr>
@@ -1916,6 +2472,7 @@
         <w:pStyle w:val="Heading1"/>
         <w:spacing w:after="200" w:before="400"/>
       </w:pPr>
+      <w:bookmarkStart w:id="909" w:name="_Toc90000010"/>
       <w:r>
         <w:rPr>
           <w:b/>
@@ -1926,12 +2483,14 @@
         </w:rPr>
         <w:t xml:space="preserve">5. Key Features Delivered</w:t>
       </w:r>
+      <w:bookmarkEnd w:id="909"/>
     </w:p>
     <w:p>
       <w:pPr>
         <w:pStyle w:val="Heading2"/>
         <w:spacing w:after="150" w:before="300"/>
       </w:pPr>
+      <w:bookmarkStart w:id="910" w:name="_Toc90000011"/>
       <w:r>
         <w:rPr>
           <w:b/>
@@ -1942,6 +2501,7 @@
         </w:rPr>
         <w:t xml:space="preserve">5.1 By Role</w:t>
       </w:r>
+      <w:bookmarkEnd w:id="910"/>
     </w:p>
     <w:tbl>
       <w:tblPr>
@@ -2304,6 +2864,7 @@
         <w:pStyle w:val="Heading2"/>
         <w:spacing w:after="150" w:before="300"/>
       </w:pPr>
+      <w:bookmarkStart w:id="911" w:name="_Toc90000012"/>
       <w:r>
         <w:rPr>
           <w:b/>
@@ -2314,6 +2875,7 @@
         </w:rPr>
         <w:t xml:space="preserve">5.2 Deliverable 5 Highlights</w:t>
       </w:r>
+      <w:bookmarkEnd w:id="911"/>
     </w:p>
     <w:p>
       <w:pPr>
@@ -2333,6 +2895,7 @@
         <w:pStyle w:val="Heading2"/>
         <w:spacing w:after="150" w:before="300"/>
       </w:pPr>
+      <w:bookmarkStart w:id="912" w:name="_Toc90000013"/>
       <w:r>
         <w:rPr>
           <w:b/>
@@ -2343,6 +2906,7 @@
         </w:rPr>
         <w:t xml:space="preserve">5.3 Billing Engine Highlights</w:t>
       </w:r>
+      <w:bookmarkEnd w:id="912"/>
     </w:p>
     <w:p>
       <w:pPr>
@@ -2362,6 +2926,7 @@
         <w:pStyle w:val="Heading1"/>
         <w:spacing w:after="200" w:before="400"/>
       </w:pPr>
+      <w:bookmarkStart w:id="913" w:name="_Toc90000014"/>
       <w:r>
         <w:rPr>
           <w:b/>
@@ -2372,6 +2937,7 @@
         </w:rPr>
         <w:t xml:space="preserve">6. Testing &amp; Quality Assurance Results</w:t>
       </w:r>
+      <w:bookmarkEnd w:id="913"/>
     </w:p>
     <w:p>
       <w:pPr>
@@ -2859,6 +3425,7 @@
         <w:pStyle w:val="Heading2"/>
         <w:spacing w:after="150" w:before="300"/>
       </w:pPr>
+      <w:bookmarkStart w:id="914" w:name="_Toc90000015"/>
       <w:r>
         <w:rPr>
           <w:b/>
@@ -2869,6 +3436,7 @@
         </w:rPr>
         <w:t xml:space="preserve">6.1 What the Suite Verifies</w:t>
       </w:r>
+      <w:bookmarkEnd w:id="914"/>
     </w:p>
     <w:p>
       <w:pPr>
@@ -2996,6 +3564,7 @@
         <w:pStyle w:val="Heading1"/>
         <w:spacing w:after="200" w:before="400"/>
       </w:pPr>
+      <w:bookmarkStart w:id="915" w:name="_Toc90000016"/>
       <w:r>
         <w:rPr>
           <w:b/>
@@ -3006,6 +3575,7 @@
         </w:rPr>
         <w:t xml:space="preserve">7. Challenges &amp; Lessons Learned</w:t>
       </w:r>
+      <w:bookmarkEnd w:id="915"/>
     </w:p>
     <w:tbl>
       <w:tblPr>
@@ -3381,6 +3951,7 @@
         <w:pStyle w:val="Heading1"/>
         <w:spacing w:after="200" w:before="400"/>
       </w:pPr>
+      <w:bookmarkStart w:id="916" w:name="_Toc90000017"/>
       <w:r>
         <w:rPr>
           <w:b/>
@@ -3391,6 +3962,7 @@
         </w:rPr>
         <w:t xml:space="preserve">8. Conclusion &amp; Recommendations for Future Work</w:t>
       </w:r>
+      <w:bookmarkEnd w:id="916"/>
     </w:p>
     <w:p>
       <w:pPr>
@@ -3410,6 +3982,7 @@
         <w:pStyle w:val="Heading2"/>
         <w:spacing w:after="150" w:before="300"/>
       </w:pPr>
+      <w:bookmarkStart w:id="917" w:name="_Toc90000018"/>
       <w:r>
         <w:rPr>
           <w:b/>
@@ -3420,6 +3993,7 @@
         </w:rPr>
         <w:t xml:space="preserve">8.1 Recommendations for IT402 (Capstone Part 2)</w:t>
       </w:r>
+      <w:bookmarkEnd w:id="917"/>
     </w:p>
     <w:p>
       <w:pPr>
@@ -3556,6 +4130,7 @@
         <w:pStyle w:val="Heading1"/>
         <w:spacing w:after="200" w:before="400"/>
       </w:pPr>
+      <w:bookmarkStart w:id="918" w:name="_Toc90000019"/>
       <w:r>
         <w:rPr>
           <w:b/>
@@ -3566,6 +4141,7 @@
         </w:rPr>
         <w:t xml:space="preserve">Appendix: Project Statistics Summary</w:t>
       </w:r>
+      <w:bookmarkEnd w:id="918"/>
     </w:p>
     <w:tbl>
       <w:tblPr>
@@ -4975,5 +5551,55 @@
       <w:szCs w:val="20"/>
     </w:rPr>
   </w:style>
+  <w:style w:type="paragraph" w:styleId="TOCHeading">
+    <w:name w:val="TOC Heading"/>
+    <w:basedOn w:val="Heading1"/>
+    <w:next w:val="Normal"/>
+    <w:uiPriority w:val="39"/>
+    <w:unhideWhenUsed/>
+    <w:qFormat/>
+    <w:pPr>
+      <w:outlineLvl w:val="9"/>
+    </w:pPr>
+  </w:style>
+  <w:style w:type="paragraph" w:styleId="TOC1">
+    <w:name w:val="toc 1"/>
+    <w:basedOn w:val="Normal"/>
+    <w:next w:val="Normal"/>
+    <w:uiPriority w:val="39"/>
+    <w:unhideWhenUsed/>
+    <w:pPr>
+      <w:tabs>
+        <w:tab w:val="right" w:leader="dot" w:pos="10070"/>
+      </w:tabs>
+      <w:spacing w:before="120" w:after="60"/>
+    </w:pPr>
+    <w:rPr>
+      <w:b/>
+      <w:bCs/>
+      <w:color w:val="0F172A"/>
+      <w:sz w:val="22"/>
+      <w:szCs w:val="22"/>
+    </w:rPr>
+  </w:style>
+  <w:style w:type="paragraph" w:styleId="TOC2">
+    <w:name w:val="toc 2"/>
+    <w:basedOn w:val="Normal"/>
+    <w:next w:val="Normal"/>
+    <w:uiPriority w:val="39"/>
+    <w:unhideWhenUsed/>
+    <w:pPr>
+      <w:tabs>
+        <w:tab w:val="right" w:leader="dot" w:pos="10070"/>
+      </w:tabs>
+      <w:spacing w:before="0" w:after="60"/>
+      <w:ind w:left="360"/>
+    </w:pPr>
+    <w:rPr>
+      <w:color w:val="1E293B"/>
+      <w:sz w:val="21"/>
+      <w:szCs w:val="21"/>
+    </w:rPr>
+  </w:style>
 </w:styles>
 </file>
</xml_diff>

<commit_message>
Update the test count and coverage in the README and D6 final report
The staff-login and payment-date fixes added two tests. Re-running the
suite (pytest --cov=backend, 24 September 2026) gives 204 tests, 204
passed, 0 skipped, 0 failures, and 83% statement coverage (models.py at
99%). The README and report said 202 tests, 201 passed, 1 skipped and
82% (models.py 98%), measured on a date when the month-end scheduler
test skips itself.

Report: executive summary, the "every number was produced by running
the code" sentence, the Testing results table and its coverage note,
the conclusion, and the Appendix statistics table. The skip explanation
is kept, reworded to say one test self-skips on dates near month-end.
The report still validates, stays 11 pages, and every table of contents
entry still points to the right page.

Co-Authored-By: Claude Opus 5.5 <noreply@anthropic.com>
Claude-Session: https://claude.ai/code/session_01Ae7GFufZcC1fFQLcjKeCLN
</commit_message>
<xml_diff>
--- a/docs/ABDURRAHMAAN_IT401_DEL_6_FINAL_REPORT.docx
+++ b/docs/ABDURRAHMAAN_IT401_DEL_6_FINAL_REPORT.docx
@@ -146,33 +146,17 @@
           </w:pPr>
           <w:r>
             <w:fldChar w:fldCharType="begin"/>
-          </w:r>
-          <w:r>
             <w:instrText xml:space="preserve"> TOC \o "1-3" \h \z \u </w:instrText>
-          </w:r>
-          <w:r>
             <w:fldChar w:fldCharType="separate"/>
           </w:r>
           <w:hyperlink w:anchor="_Toc90000001" w:history="1">
             <w:r>
               <w:t xml:space="preserve">1. Executive Summary</w:t>
-            </w:r>
-            <w:r>
               <w:tab/>
-            </w:r>
-            <w:r>
               <w:fldChar w:fldCharType="begin"/>
-            </w:r>
-            <w:r>
               <w:instrText xml:space="preserve"> PAGEREF _Toc90000001 \h </w:instrText>
-            </w:r>
-            <w:r>
               <w:fldChar w:fldCharType="separate"/>
-            </w:r>
-            <w:r>
               <w:t>3</w:t>
-            </w:r>
-            <w:r>
               <w:fldChar w:fldCharType="end"/>
             </w:r>
           </w:hyperlink>
@@ -184,23 +168,11 @@
           <w:hyperlink w:anchor="_Toc90000002" w:history="1">
             <w:r>
               <w:t xml:space="preserve">2. Project Overview &amp; Objectives</w:t>
-            </w:r>
-            <w:r>
               <w:tab/>
-            </w:r>
-            <w:r>
               <w:fldChar w:fldCharType="begin"/>
-            </w:r>
-            <w:r>
               <w:instrText xml:space="preserve"> PAGEREF _Toc90000002 \h </w:instrText>
-            </w:r>
-            <w:r>
               <w:fldChar w:fldCharType="separate"/>
-            </w:r>
-            <w:r>
               <w:t>3</w:t>
-            </w:r>
-            <w:r>
               <w:fldChar w:fldCharType="end"/>
             </w:r>
           </w:hyperlink>
@@ -212,23 +184,11 @@
           <w:hyperlink w:anchor="_Toc90000003" w:history="1">
             <w:r>
               <w:t xml:space="preserve">2.1 Objectives</w:t>
-            </w:r>
-            <w:r>
               <w:tab/>
-            </w:r>
-            <w:r>
               <w:fldChar w:fldCharType="begin"/>
-            </w:r>
-            <w:r>
               <w:instrText xml:space="preserve"> PAGEREF _Toc90000003 \h </w:instrText>
-            </w:r>
-            <w:r>
               <w:fldChar w:fldCharType="separate"/>
-            </w:r>
-            <w:r>
               <w:t>3</w:t>
-            </w:r>
-            <w:r>
               <w:fldChar w:fldCharType="end"/>
             </w:r>
           </w:hyperlink>
@@ -240,23 +200,11 @@
           <w:hyperlink w:anchor="_Toc90000004" w:history="1">
             <w:r>
               <w:t xml:space="preserve">3. Deliverables Summary</w:t>
-            </w:r>
-            <w:r>
               <w:tab/>
-            </w:r>
-            <w:r>
               <w:fldChar w:fldCharType="begin"/>
-            </w:r>
-            <w:r>
               <w:instrText xml:space="preserve"> PAGEREF _Toc90000004 \h </w:instrText>
-            </w:r>
-            <w:r>
               <w:fldChar w:fldCharType="separate"/>
-            </w:r>
-            <w:r>
               <w:t>4</w:t>
-            </w:r>
-            <w:r>
               <w:fldChar w:fldCharType="end"/>
             </w:r>
           </w:hyperlink>
@@ -268,23 +216,11 @@
           <w:hyperlink w:anchor="_Toc90000005" w:history="1">
             <w:r>
               <w:t xml:space="preserve">3.1 Deliverable 3 — Working Prototype</w:t>
-            </w:r>
-            <w:r>
               <w:tab/>
-            </w:r>
-            <w:r>
               <w:fldChar w:fldCharType="begin"/>
-            </w:r>
-            <w:r>
               <w:instrText xml:space="preserve"> PAGEREF _Toc90000005 \h </w:instrText>
-            </w:r>
-            <w:r>
               <w:fldChar w:fldCharType="separate"/>
-            </w:r>
-            <w:r>
               <w:t>4</w:t>
-            </w:r>
-            <w:r>
               <w:fldChar w:fldCharType="end"/>
             </w:r>
           </w:hyperlink>
@@ -296,23 +232,11 @@
           <w:hyperlink w:anchor="_Toc90000006" w:history="1">
             <w:r>
               <w:t xml:space="preserve">3.2 Deliverable 4 — Complete Project Report</w:t>
-            </w:r>
-            <w:r>
               <w:tab/>
-            </w:r>
-            <w:r>
               <w:fldChar w:fldCharType="begin"/>
-            </w:r>
-            <w:r>
               <w:instrText xml:space="preserve"> PAGEREF _Toc90000006 \h </w:instrText>
-            </w:r>
-            <w:r>
               <w:fldChar w:fldCharType="separate"/>
-            </w:r>
-            <w:r>
               <w:t>5</w:t>
-            </w:r>
-            <w:r>
               <w:fldChar w:fldCharType="end"/>
             </w:r>
           </w:hyperlink>
@@ -324,23 +248,11 @@
           <w:hyperlink w:anchor="_Toc90000007" w:history="1">
             <w:r>
               <w:t xml:space="preserve">3.3 Deliverable 5 — 100% Feature Completion</w:t>
-            </w:r>
-            <w:r>
               <w:tab/>
-            </w:r>
-            <w:r>
               <w:fldChar w:fldCharType="begin"/>
-            </w:r>
-            <w:r>
               <w:instrText xml:space="preserve"> PAGEREF _Toc90000007 \h </w:instrText>
-            </w:r>
-            <w:r>
               <w:fldChar w:fldCharType="separate"/>
-            </w:r>
-            <w:r>
               <w:t>5</w:t>
-            </w:r>
-            <w:r>
               <w:fldChar w:fldCharType="end"/>
             </w:r>
           </w:hyperlink>
@@ -352,23 +264,11 @@
           <w:hyperlink w:anchor="_Toc90000008" w:history="1">
             <w:r>
               <w:t xml:space="preserve">3.4 Extended Scope — The Billing Engine</w:t>
-            </w:r>
-            <w:r>
               <w:tab/>
-            </w:r>
-            <w:r>
               <w:fldChar w:fldCharType="begin"/>
-            </w:r>
-            <w:r>
               <w:instrText xml:space="preserve"> PAGEREF _Toc90000008 \h </w:instrText>
-            </w:r>
-            <w:r>
               <w:fldChar w:fldCharType="separate"/>
-            </w:r>
-            <w:r>
               <w:t>5</w:t>
-            </w:r>
-            <w:r>
               <w:fldChar w:fldCharType="end"/>
             </w:r>
           </w:hyperlink>
@@ -380,23 +280,11 @@
           <w:hyperlink w:anchor="_Toc90000009" w:history="1">
             <w:r>
               <w:t xml:space="preserve">4. System Architecture Summary</w:t>
-            </w:r>
-            <w:r>
               <w:tab/>
-            </w:r>
-            <w:r>
               <w:fldChar w:fldCharType="begin"/>
-            </w:r>
-            <w:r>
               <w:instrText xml:space="preserve"> PAGEREF _Toc90000009 \h </w:instrText>
-            </w:r>
-            <w:r>
               <w:fldChar w:fldCharType="separate"/>
-            </w:r>
-            <w:r>
               <w:t>6</w:t>
-            </w:r>
-            <w:r>
               <w:fldChar w:fldCharType="end"/>
             </w:r>
           </w:hyperlink>
@@ -408,23 +296,11 @@
           <w:hyperlink w:anchor="_Toc90000010" w:history="1">
             <w:r>
               <w:t xml:space="preserve">5. Key Features Delivered</w:t>
-            </w:r>
-            <w:r>
               <w:tab/>
-            </w:r>
-            <w:r>
               <w:fldChar w:fldCharType="begin"/>
-            </w:r>
-            <w:r>
               <w:instrText xml:space="preserve"> PAGEREF _Toc90000010 \h </w:instrText>
-            </w:r>
-            <w:r>
               <w:fldChar w:fldCharType="separate"/>
-            </w:r>
-            <w:r>
               <w:t>7</w:t>
-            </w:r>
-            <w:r>
               <w:fldChar w:fldCharType="end"/>
             </w:r>
           </w:hyperlink>
@@ -436,23 +312,11 @@
           <w:hyperlink w:anchor="_Toc90000011" w:history="1">
             <w:r>
               <w:t xml:space="preserve">5.1 By Role</w:t>
-            </w:r>
-            <w:r>
               <w:tab/>
-            </w:r>
-            <w:r>
               <w:fldChar w:fldCharType="begin"/>
-            </w:r>
-            <w:r>
               <w:instrText xml:space="preserve"> PAGEREF _Toc90000011 \h </w:instrText>
-            </w:r>
-            <w:r>
               <w:fldChar w:fldCharType="separate"/>
-            </w:r>
-            <w:r>
               <w:t>7</w:t>
-            </w:r>
-            <w:r>
               <w:fldChar w:fldCharType="end"/>
             </w:r>
           </w:hyperlink>
@@ -464,23 +328,11 @@
           <w:hyperlink w:anchor="_Toc90000012" w:history="1">
             <w:r>
               <w:t xml:space="preserve">5.2 Deliverable 5 Highlights</w:t>
-            </w:r>
-            <w:r>
               <w:tab/>
-            </w:r>
-            <w:r>
               <w:fldChar w:fldCharType="begin"/>
-            </w:r>
-            <w:r>
               <w:instrText xml:space="preserve"> PAGEREF _Toc90000012 \h </w:instrText>
-            </w:r>
-            <w:r>
               <w:fldChar w:fldCharType="separate"/>
-            </w:r>
-            <w:r>
               <w:t>7</w:t>
-            </w:r>
-            <w:r>
               <w:fldChar w:fldCharType="end"/>
             </w:r>
           </w:hyperlink>
@@ -492,23 +344,11 @@
           <w:hyperlink w:anchor="_Toc90000013" w:history="1">
             <w:r>
               <w:t xml:space="preserve">5.3 Billing Engine Highlights</w:t>
-            </w:r>
-            <w:r>
               <w:tab/>
-            </w:r>
-            <w:r>
               <w:fldChar w:fldCharType="begin"/>
-            </w:r>
-            <w:r>
               <w:instrText xml:space="preserve"> PAGEREF _Toc90000013 \h </w:instrText>
-            </w:r>
-            <w:r>
               <w:fldChar w:fldCharType="separate"/>
-            </w:r>
-            <w:r>
               <w:t>7</w:t>
-            </w:r>
-            <w:r>
               <w:fldChar w:fldCharType="end"/>
             </w:r>
           </w:hyperlink>
@@ -520,23 +360,11 @@
           <w:hyperlink w:anchor="_Toc90000014" w:history="1">
             <w:r>
               <w:t xml:space="preserve">6. Testing &amp; Quality Assurance Results</w:t>
-            </w:r>
-            <w:r>
               <w:tab/>
-            </w:r>
-            <w:r>
               <w:fldChar w:fldCharType="begin"/>
-            </w:r>
-            <w:r>
               <w:instrText xml:space="preserve"> PAGEREF _Toc90000014 \h </w:instrText>
-            </w:r>
-            <w:r>
               <w:fldChar w:fldCharType="separate"/>
-            </w:r>
-            <w:r>
               <w:t>7</w:t>
-            </w:r>
-            <w:r>
               <w:fldChar w:fldCharType="end"/>
             </w:r>
           </w:hyperlink>
@@ -548,23 +376,11 @@
           <w:hyperlink w:anchor="_Toc90000015" w:history="1">
             <w:r>
               <w:t xml:space="preserve">6.1 What the Suite Verifies</w:t>
-            </w:r>
-            <w:r>
               <w:tab/>
-            </w:r>
-            <w:r>
               <w:fldChar w:fldCharType="begin"/>
-            </w:r>
-            <w:r>
               <w:instrText xml:space="preserve"> PAGEREF _Toc90000015 \h </w:instrText>
-            </w:r>
-            <w:r>
               <w:fldChar w:fldCharType="separate"/>
-            </w:r>
-            <w:r>
               <w:t>8</w:t>
-            </w:r>
-            <w:r>
               <w:fldChar w:fldCharType="end"/>
             </w:r>
           </w:hyperlink>
@@ -576,23 +392,11 @@
           <w:hyperlink w:anchor="_Toc90000016" w:history="1">
             <w:r>
               <w:t xml:space="preserve">7. Challenges &amp; Lessons Learned</w:t>
-            </w:r>
-            <w:r>
               <w:tab/>
-            </w:r>
-            <w:r>
               <w:fldChar w:fldCharType="begin"/>
-            </w:r>
-            <w:r>
               <w:instrText xml:space="preserve"> PAGEREF _Toc90000016 \h </w:instrText>
-            </w:r>
-            <w:r>
               <w:fldChar w:fldCharType="separate"/>
-            </w:r>
-            <w:r>
               <w:t>8</w:t>
-            </w:r>
-            <w:r>
               <w:fldChar w:fldCharType="end"/>
             </w:r>
           </w:hyperlink>
@@ -604,23 +408,11 @@
           <w:hyperlink w:anchor="_Toc90000017" w:history="1">
             <w:r>
               <w:t xml:space="preserve">8. Conclusion &amp; Recommendations for Future Work</w:t>
-            </w:r>
-            <w:r>
               <w:tab/>
-            </w:r>
-            <w:r>
               <w:fldChar w:fldCharType="begin"/>
-            </w:r>
-            <w:r>
               <w:instrText xml:space="preserve"> PAGEREF _Toc90000017 \h </w:instrText>
-            </w:r>
-            <w:r>
               <w:fldChar w:fldCharType="separate"/>
-            </w:r>
-            <w:r>
               <w:t>9</w:t>
-            </w:r>
-            <w:r>
               <w:fldChar w:fldCharType="end"/>
             </w:r>
           </w:hyperlink>
@@ -632,23 +424,11 @@
           <w:hyperlink w:anchor="_Toc90000018" w:history="1">
             <w:r>
               <w:t xml:space="preserve">8.1 Recommendations for IT402 (Capstone Part 2)</w:t>
-            </w:r>
-            <w:r>
               <w:tab/>
-            </w:r>
-            <w:r>
               <w:fldChar w:fldCharType="begin"/>
-            </w:r>
-            <w:r>
               <w:instrText xml:space="preserve"> PAGEREF _Toc90000018 \h </w:instrText>
-            </w:r>
-            <w:r>
               <w:fldChar w:fldCharType="separate"/>
-            </w:r>
-            <w:r>
               <w:t>9</w:t>
-            </w:r>
-            <w:r>
               <w:fldChar w:fldCharType="end"/>
             </w:r>
           </w:hyperlink>
@@ -660,23 +440,11 @@
           <w:hyperlink w:anchor="_Toc90000019" w:history="1">
             <w:r>
               <w:t xml:space="preserve">Appendix: Project Statistics Summary</w:t>
-            </w:r>
-            <w:r>
               <w:tab/>
-            </w:r>
-            <w:r>
               <w:fldChar w:fldCharType="begin"/>
-            </w:r>
-            <w:r>
               <w:instrText xml:space="preserve"> PAGEREF _Toc90000019 \h </w:instrText>
-            </w:r>
-            <w:r>
               <w:fldChar w:fldCharType="separate"/>
-            </w:r>
-            <w:r>
               <w:t>11</w:t>
-            </w:r>
-            <w:r>
               <w:fldChar w:fldCharType="end"/>
             </w:r>
           </w:hyperlink>
@@ -734,7 +502,7 @@
           <w:sz w:val="21"/>
           <w:szCs w:val="21"/>
         </w:rPr>
-        <w:t xml:space="preserve">The finished system is a Flask web application backed by a database of 18 tables (13 from the original design plus 5 added for the billing engine), organized into 10 route blueprints and five role-scoped user experiences (Property Owner, Property Manager, Tenant, Maintenance Staff, and Administrator). Every one of the 25 use cases defined in the original requirements has a corresponding route or scheduled background job, a user interface, and at least one automated test. The application is verified by a 202-test automated suite (201 passing, 1 self-skipping near month-end) with zero failures and 82% statement coverage, and it runs entirely offline — no paid external account (email, SMS, or payment provider) is required to build, run, or test it.</w:t>
+        <w:t xml:space="preserve">The finished system is a Flask web application backed by a database of 18 tables (13 from the original design plus 5 added for the billing engine), organized into 10 route blueprints and five role-scoped user experiences (Property Owner, Property Manager, Tenant, Maintenance Staff, and Administrator). Every one of the 25 use cases defined in the original requirements has a corresponding route or scheduled background job, a user interface, and at least one automated test. The application is verified by a 204-test automated suite (all 204 passing on the latest run; one scheduler test self-skips on dates near month-end) with zero failures and 83% statement coverage, and it runs entirely offline — no paid external account (email, SMS, or payment provider) is required to build, run, or test it.</w:t>
       </w:r>
     </w:p>
     <w:p>
@@ -747,7 +515,7 @@
           <w:sz w:val="21"/>
           <w:szCs w:val="21"/>
         </w:rPr>
-        <w:t xml:space="preserve">The guiding principle across this project has been that a claim in the documentation should be a fact about the running system, not a target for it. Every number in this report — 25 use cases, 18 tables, 202 tests, 82% coverage — was produced by actually running the code.</w:t>
+        <w:t xml:space="preserve">The guiding principle across this project has been that a claim in the documentation should be a fact about the running system, not a target for it. Every number in this report — 25 use cases, 18 tables, 204 tests, 83% coverage — was produced by actually running the code.</w:t>
       </w:r>
     </w:p>
     <w:p>
@@ -3078,7 +2846,7 @@
                 <w:sz w:val="20"/>
                 <w:szCs w:val="20"/>
               </w:rPr>
-              <w:t xml:space="preserve">202</w:t>
+              <w:t xml:space="preserve">204</w:t>
             </w:r>
           </w:p>
         </w:tc>
@@ -3134,7 +2902,7 @@
                 <w:sz w:val="20"/>
                 <w:szCs w:val="20"/>
               </w:rPr>
-              <w:t xml:space="preserve">201</w:t>
+              <w:t xml:space="preserve">204</w:t>
             </w:r>
           </w:p>
         </w:tc>
@@ -3190,7 +2958,7 @@
                 <w:sz w:val="20"/>
                 <w:szCs w:val="20"/>
               </w:rPr>
-              <w:t xml:space="preserve">1 (self-skips within a few days of month-end, where due-day clipping could shift the asserted date by a day)</w:t>
+              <w:t xml:space="preserve">0 on the latest run (one scheduler test self-skips on dates near month-end, where due-day clipping could shift the asserted date by a day)</w:t>
             </w:r>
           </w:p>
         </w:tc>
@@ -3302,7 +3070,7 @@
                 <w:sz w:val="20"/>
                 <w:szCs w:val="20"/>
               </w:rPr>
-              <w:t xml:space="preserve">82%</w:t>
+              <w:t xml:space="preserve">83%</w:t>
             </w:r>
           </w:p>
         </w:tc>
@@ -3556,7 +3324,7 @@
           <w:sz w:val="21"/>
           <w:szCs w:val="21"/>
         </w:rPr>
-        <w:t xml:space="preserve">Coverage is concentrated in models.py (98%), security.py (92%), and the reports service (95%) — the modules carrying the business rules this project cares most about proving correct. The lowest-coverage files are thin route handlers whose uncovered branches are error-message formatting, and seed.py (demo-data tooling, intentionally outside the suite’s scope).</w:t>
+        <w:t xml:space="preserve">Coverage is concentrated in models.py (99%), security.py (92%), and the reports service (95%) — the modules carrying the business rules this project cares most about proving correct. The lowest-coverage files are thin route handlers whose uncovered branches are error-message formatting, and seed.py (demo-data tooling, intentionally outside the suite’s scope).</w:t>
       </w:r>
     </w:p>
     <w:p>
@@ -3974,7 +3742,7 @@
           <w:sz w:val="21"/>
           <w:szCs w:val="21"/>
         </w:rPr>
-        <w:t xml:space="preserve">RentalPro was carried from a requirements document, through a design, to a working prototype, a full project report, 100% feature completion, a demonstration and presentation package, and now an extended billing engine. Every claim in this document is backed by a running, tested system: 25 of 25 use cases implemented, each with a route and a covering test; the original 13-table database design implemented exactly as specified, since grown to 18 tables; 201 of 202 automated tests passing with zero failures at 82% statement coverage; eight additional feature gaps closed in Deliverable 5; and eight further billing capabilities added afterward. The application runs — and its test suite passes — using only Docker or a local Python virtual environment, with zero paid external accounts required.</w:t>
+        <w:t xml:space="preserve">RentalPro was carried from a requirements document, through a design, to a working prototype, a full project report, 100% feature completion, a demonstration and presentation package, and now an extended billing engine. Every claim in this document is backed by a running, tested system: 25 of 25 use cases implemented, each with a route and a covering test; the original 13-table database design implemented exactly as specified, since grown to 18 tables; all 204 automated tests passing with zero failures at 83% statement coverage; eight additional feature gaps closed in Deliverable 5; and eight further billing capabilities added afterward. The application runs — and its test suite passes — using only Docker or a local Python virtual environment, with zero paid external accounts required.</w:t>
       </w:r>
     </w:p>
     <w:p>
@@ -4605,7 +4373,7 @@
                 <w:sz w:val="20"/>
                 <w:szCs w:val="20"/>
               </w:rPr>
-              <w:t xml:space="preserve">202</w:t>
+              <w:t xml:space="preserve">204</w:t>
             </w:r>
           </w:p>
         </w:tc>
@@ -4661,7 +4429,7 @@
                 <w:sz w:val="20"/>
                 <w:szCs w:val="20"/>
               </w:rPr>
-              <w:t xml:space="preserve">201</w:t>
+              <w:t xml:space="preserve">204</w:t>
             </w:r>
           </w:p>
         </w:tc>
@@ -4717,7 +4485,7 @@
                 <w:sz w:val="20"/>
                 <w:szCs w:val="20"/>
               </w:rPr>
-              <w:t xml:space="preserve">1</w:t>
+              <w:t xml:space="preserve">0</w:t>
             </w:r>
           </w:p>
         </w:tc>
@@ -4829,7 +4597,7 @@
                 <w:sz w:val="20"/>
                 <w:szCs w:val="20"/>
               </w:rPr>
-              <w:t xml:space="preserve">82%</w:t>
+              <w:t xml:space="preserve">83%</w:t>
             </w:r>
           </w:p>
         </w:tc>

</xml_diff>

<commit_message>
Update the D6 final report to the current system
- New section 3.5 (Extended Scope - Usability, Localisation & Harare Demo
  Data): property map, the top-bar redesign with Harare photography, the
  English/Shona switch and why it replaces the Arabic named in the SRS,
  tenant-friendly unit labels, the logged-in redirect fix, and the Harare
  seed data.
- New section 5.4 and a matching Deliverables-table row, testing bullet,
  challenges row, IT402 recommendation and statistics rows.
- Figures brought up to date: 226 tests (was 204), 82% coverage (83%),
  38 templates (35), per-module coverage (security.py 93%), and i18n.py
  in the architecture table.
- Table of contents regenerated with correct page numbers (12 pages).

Co-Authored-By: Claude Opus 5.5 <noreply@anthropic.com>
Claude-Session: https://claude.ai/code/session_01BLVAgZrQBMgC6fgji1xmot
</commit_message>
<xml_diff>
--- a/docs/ABDURRAHMAAN_IT401_DEL_6_FINAL_REPORT.docx
+++ b/docs/ABDURRAHMAAN_IT401_DEL_6_FINAL_REPORT.docx
@@ -220,7 +220,7 @@
               <w:fldChar w:fldCharType="begin"/>
               <w:instrText xml:space="preserve"> PAGEREF _Toc90000005 \h </w:instrText>
               <w:fldChar w:fldCharType="separate"/>
-              <w:t>4</w:t>
+              <w:t>5</w:t>
               <w:fldChar w:fldCharType="end"/>
             </w:r>
           </w:hyperlink>
@@ -275,6 +275,22 @@
         </w:p>
         <w:p>
           <w:pPr>
+            <w:pStyle w:val="TOC2"/>
+          </w:pPr>
+          <w:hyperlink w:anchor="_Toc90000030" w:history="1">
+            <w:r>
+              <w:t xml:space="preserve">3.5 Extended Scope — Usability, Localisation &amp; Harare Demo Data</w:t>
+              <w:tab/>
+              <w:fldChar w:fldCharType="begin"/>
+              <w:instrText xml:space="preserve"> PAGEREF _Toc90000030 \h </w:instrText>
+              <w:fldChar w:fldCharType="separate"/>
+              <w:t>6</w:t>
+              <w:fldChar w:fldCharType="end"/>
+            </w:r>
+          </w:hyperlink>
+        </w:p>
+        <w:p>
+          <w:pPr>
             <w:pStyle w:val="TOC1"/>
           </w:pPr>
           <w:hyperlink w:anchor="_Toc90000009" w:history="1">
@@ -284,7 +300,7 @@
               <w:fldChar w:fldCharType="begin"/>
               <w:instrText xml:space="preserve"> PAGEREF _Toc90000009 \h </w:instrText>
               <w:fldChar w:fldCharType="separate"/>
-              <w:t>6</w:t>
+              <w:t>7</w:t>
               <w:fldChar w:fldCharType="end"/>
             </w:r>
           </w:hyperlink>
@@ -300,7 +316,7 @@
               <w:fldChar w:fldCharType="begin"/>
               <w:instrText xml:space="preserve"> PAGEREF _Toc90000010 \h </w:instrText>
               <w:fldChar w:fldCharType="separate"/>
-              <w:t>7</w:t>
+              <w:t>8</w:t>
               <w:fldChar w:fldCharType="end"/>
             </w:r>
           </w:hyperlink>
@@ -316,7 +332,7 @@
               <w:fldChar w:fldCharType="begin"/>
               <w:instrText xml:space="preserve"> PAGEREF _Toc90000011 \h </w:instrText>
               <w:fldChar w:fldCharType="separate"/>
-              <w:t>7</w:t>
+              <w:t>8</w:t>
               <w:fldChar w:fldCharType="end"/>
             </w:r>
           </w:hyperlink>
@@ -332,7 +348,7 @@
               <w:fldChar w:fldCharType="begin"/>
               <w:instrText xml:space="preserve"> PAGEREF _Toc90000012 \h </w:instrText>
               <w:fldChar w:fldCharType="separate"/>
-              <w:t>7</w:t>
+              <w:t>8</w:t>
               <w:fldChar w:fldCharType="end"/>
             </w:r>
           </w:hyperlink>
@@ -348,7 +364,23 @@
               <w:fldChar w:fldCharType="begin"/>
               <w:instrText xml:space="preserve"> PAGEREF _Toc90000013 \h </w:instrText>
               <w:fldChar w:fldCharType="separate"/>
-              <w:t>7</w:t>
+              <w:t>8</w:t>
+              <w:fldChar w:fldCharType="end"/>
+            </w:r>
+          </w:hyperlink>
+        </w:p>
+        <w:p>
+          <w:pPr>
+            <w:pStyle w:val="TOC2"/>
+          </w:pPr>
+          <w:hyperlink w:anchor="_Toc90000031" w:history="1">
+            <w:r>
+              <w:t xml:space="preserve">5.4 Usability &amp; Localisation Highlights</w:t>
+              <w:tab/>
+              <w:fldChar w:fldCharType="begin"/>
+              <w:instrText xml:space="preserve"> PAGEREF _Toc90000031 \h </w:instrText>
+              <w:fldChar w:fldCharType="separate"/>
+              <w:t>8</w:t>
               <w:fldChar w:fldCharType="end"/>
             </w:r>
           </w:hyperlink>
@@ -364,7 +396,7 @@
               <w:fldChar w:fldCharType="begin"/>
               <w:instrText xml:space="preserve"> PAGEREF _Toc90000014 \h </w:instrText>
               <w:fldChar w:fldCharType="separate"/>
-              <w:t>7</w:t>
+              <w:t>9</w:t>
               <w:fldChar w:fldCharType="end"/>
             </w:r>
           </w:hyperlink>
@@ -380,7 +412,7 @@
               <w:fldChar w:fldCharType="begin"/>
               <w:instrText xml:space="preserve"> PAGEREF _Toc90000015 \h </w:instrText>
               <w:fldChar w:fldCharType="separate"/>
-              <w:t>8</w:t>
+              <w:t>9</w:t>
               <w:fldChar w:fldCharType="end"/>
             </w:r>
           </w:hyperlink>
@@ -396,7 +428,7 @@
               <w:fldChar w:fldCharType="begin"/>
               <w:instrText xml:space="preserve"> PAGEREF _Toc90000016 \h </w:instrText>
               <w:fldChar w:fldCharType="separate"/>
-              <w:t>8</w:t>
+              <w:t>10</w:t>
               <w:fldChar w:fldCharType="end"/>
             </w:r>
           </w:hyperlink>
@@ -412,7 +444,7 @@
               <w:fldChar w:fldCharType="begin"/>
               <w:instrText xml:space="preserve"> PAGEREF _Toc90000017 \h </w:instrText>
               <w:fldChar w:fldCharType="separate"/>
-              <w:t>9</w:t>
+              <w:t>10</w:t>
               <w:fldChar w:fldCharType="end"/>
             </w:r>
           </w:hyperlink>
@@ -428,7 +460,7 @@
               <w:fldChar w:fldCharType="begin"/>
               <w:instrText xml:space="preserve"> PAGEREF _Toc90000018 \h </w:instrText>
               <w:fldChar w:fldCharType="separate"/>
-              <w:t>9</w:t>
+              <w:t>11</w:t>
               <w:fldChar w:fldCharType="end"/>
             </w:r>
           </w:hyperlink>
@@ -444,7 +476,7 @@
               <w:fldChar w:fldCharType="begin"/>
               <w:instrText xml:space="preserve"> PAGEREF _Toc90000019 \h </w:instrText>
               <w:fldChar w:fldCharType="separate"/>
-              <w:t>11</w:t>
+              <w:t>12</w:t>
               <w:fldChar w:fldCharType="end"/>
             </w:r>
           </w:hyperlink>
@@ -489,7 +521,7 @@
           <w:sz w:val="21"/>
           <w:szCs w:val="21"/>
         </w:rPr>
-        <w:t xml:space="preserve">RentalPro is a Digital Rental Management System built to replace the spreadsheets, paper leases, and manual reminders that independent landlords and small property managers still rely on. The project was carried out across five prior deliverables — a Software Requirements Specification (Deliverable 1), a UML and database design (Deliverable 2), a working prototype application (Deliverable 3), a complete seven-chapter project report (Deliverable 4), and, closing every remaining gap against the original requirements, 100% feature completion (Deliverable 5). Deliverable 6 — a project demonstration video, a presentation video, and this final capstone report — closed out the formal capstone submission. Since then, the system has been further extended with a complete billing engine (Section 3.4): eight additional capabilities covering charges, metering, prorated and variable rent, automated billing, statements, receipts, and expense reporting, all built additively and fully tested. This report has been updated to describe that current, running state rather than the state at the moment of the original D6 submission.</w:t>
+        <w:t xml:space="preserve">RentalPro is a Digital Rental Management System built to replace the spreadsheets, paper leases, and manual reminders that independent landlords and small property managers still rely on. The project was carried out across five prior deliverables — a Software Requirements Specification (Deliverable 1), a UML and database design (Deliverable 2), a working prototype application (Deliverable 3), a complete seven-chapter project report (Deliverable 4), and, closing every remaining gap against the original requirements, 100% feature completion (Deliverable 5). Deliverable 6 — a project demonstration video, a presentation video, and this final capstone report — closed out the formal capstone submission. Since then, the system has been further extended with a complete billing engine (Section 3.4): eight additional capabilities covering charges, metering, prorated and variable rent, automated billing, statements, receipts, and expense reporting, all built additively and fully tested. It has also gained usability and localisation work (Section 3.5): a property map, a redesigned interface with Harare photography, an English/Shona language switch, and a Harare-based demonstration portfolio. This report has been updated to describe that current, running state rather than the state at the moment of the original D6 submission.</w:t>
       </w:r>
     </w:p>
     <w:p>
@@ -502,7 +534,7 @@
           <w:sz w:val="21"/>
           <w:szCs w:val="21"/>
         </w:rPr>
-        <w:t xml:space="preserve">The finished system is a Flask web application backed by a database of 18 tables (13 from the original design plus 5 added for the billing engine), organized into 10 route blueprints and five role-scoped user experiences (Property Owner, Property Manager, Tenant, Maintenance Staff, and Administrator). Every one of the 25 use cases defined in the original requirements has a corresponding route or scheduled background job, a user interface, and at least one automated test. The application is verified by a 204-test automated suite (all 204 passing on the latest run; one scheduler test self-skips on dates near month-end) with zero failures and 83% statement coverage, and it runs entirely offline — no paid external account (email, SMS, or payment provider) is required to build, run, or test it.</w:t>
+        <w:t xml:space="preserve">The finished system is a Flask web application backed by a database of 18 tables (13 from the original design plus 5 added for the billing engine), organized into 10 route blueprints and five role-scoped user experiences (Property Owner, Property Manager, Tenant, Maintenance Staff, and Administrator). Every one of the 25 use cases defined in the original requirements has a corresponding route or scheduled background job, a user interface, and at least one automated test. The application is verified by a 226-test automated suite (all 226 passing on the latest run; one scheduler test self-skips on dates near month-end) with zero failures and 82% statement coverage, and it runs entirely offline — no paid external account (email, SMS, or payment provider) is required to build, run, or test it.</w:t>
       </w:r>
     </w:p>
     <w:p>
@@ -515,7 +547,7 @@
           <w:sz w:val="21"/>
           <w:szCs w:val="21"/>
         </w:rPr>
-        <w:t xml:space="preserve">The guiding principle across this project has been that a claim in the documentation should be a fact about the running system, not a target for it. Every number in this report — 25 use cases, 18 tables, 204 tests, 83% coverage — was produced by actually running the code.</w:t>
+        <w:t xml:space="preserve">The guiding principle across this project has been that a claim in the documentation should be a fact about the running system, not a target for it. Every number in this report — 25 use cases, 18 tables, 226 tests, 82% coverage — was produced by actually running the code.</w:t>
       </w:r>
     </w:p>
     <w:p>
@@ -1422,6 +1454,89 @@
           </w:p>
         </w:tc>
       </w:tr>
+      <w:tr>
+        <w:tc>
+          <w:tcPr>
+            <w:tcW w:type="dxa" w:w="2000"/>
+            <w:shd w:fill="FFFFFF" w:val="clear"/>
+            <w:tcMar>
+              <w:top w:type="dxa" w:w="100"/>
+              <w:left w:type="dxa" w:w="120"/>
+              <w:bottom w:type="dxa" w:w="100"/>
+              <w:right w:type="dxa" w:w="120"/>
+            </w:tcMar>
+          </w:tcPr>
+          <w:p>
+            <w:pPr>
+              <w:jc w:val="left"/>
+            </w:pPr>
+            <w:r>
+              <w:rPr>
+                <w:b w:val="false"/>
+                <w:bCs w:val="false"/>
+                <w:color w:val="1E293B"/>
+                <w:sz w:val="20"/>
+                <w:szCs w:val="20"/>
+              </w:rPr>
+              <w:t xml:space="preserve">Extended Scope — Usability &amp; Localisation</w:t>
+            </w:r>
+          </w:p>
+        </w:tc>
+        <w:tc>
+          <w:tcPr>
+            <w:tcW w:type="dxa" w:w="6500"/>
+            <w:shd w:fill="FFFFFF" w:val="clear"/>
+            <w:tcMar>
+              <w:top w:type="dxa" w:w="100"/>
+              <w:left w:type="dxa" w:w="120"/>
+              <w:bottom w:type="dxa" w:w="100"/>
+              <w:right w:type="dxa" w:w="120"/>
+            </w:tcMar>
+          </w:tcPr>
+          <w:p>
+            <w:pPr>
+              <w:jc w:val="left"/>
+            </w:pPr>
+            <w:r>
+              <w:rPr>
+                <w:b w:val="false"/>
+                <w:bCs w:val="false"/>
+                <w:color w:val="1E293B"/>
+                <w:sz w:val="20"/>
+                <w:szCs w:val="20"/>
+              </w:rPr>
+              <w:t xml:space="preserve">Property map, a redesigned top-bar interface with Harare photo backgrounds, an English/Shona language switch, tenant-friendly unit labels, a logged-in redirect fix, and Harare demo data — 22 dedicated tests</w:t>
+            </w:r>
+          </w:p>
+        </w:tc>
+        <w:tc>
+          <w:tcPr>
+            <w:tcW w:type="dxa" w:w="1660"/>
+            <w:shd w:fill="FFFFFF" w:val="clear"/>
+            <w:tcMar>
+              <w:top w:type="dxa" w:w="100"/>
+              <w:left w:type="dxa" w:w="120"/>
+              <w:bottom w:type="dxa" w:w="100"/>
+              <w:right w:type="dxa" w:w="120"/>
+            </w:tcMar>
+          </w:tcPr>
+          <w:p>
+            <w:pPr>
+              <w:jc w:val="left"/>
+            </w:pPr>
+            <w:r>
+              <w:rPr>
+                <w:b w:val="false"/>
+                <w:bCs w:val="false"/>
+                <w:color w:val="1E293B"/>
+                <w:sz w:val="20"/>
+                <w:szCs w:val="20"/>
+              </w:rPr>
+              <w:t xml:space="preserve">Complete</w:t>
+            </w:r>
+          </w:p>
+        </w:tc>
+      </w:tr>
     </w:tbl>
     <w:p>
       <w:pPr>
@@ -1833,6 +1948,158 @@
           <w:szCs w:val="21"/>
         </w:rPr>
         <w:t xml:space="preserve">Property expenses &amp; net income: owner-side operating costs (tax, insurance, management fees, general upkeep) are now tracked per property and feed a true net income estimate, alongside maintenance cost, in both the on-screen and exported reports.</w:t>
+      </w:r>
+    </w:p>
+    <w:p>
+      <w:pPr>
+        <w:pStyle w:val="Heading2"/>
+        <w:spacing w:after="150" w:before="300"/>
+      </w:pPr>
+      <w:bookmarkStart w:id="930" w:name="_Toc90000030"/>
+      <w:r>
+        <w:rPr>
+          <w:b/>
+          <w:bCs/>
+          <w:color w:val="2563EB"/>
+          <w:sz w:val="26"/>
+          <w:szCs w:val="26"/>
+        </w:rPr>
+        <w:t xml:space="preserve">3.5 Extended Scope — Usability, Localisation &amp; Harare Demo Data</w:t>
+      </w:r>
+      <w:bookmarkEnd w:id="930"/>
+    </w:p>
+    <w:p>
+      <w:pPr>
+        <w:spacing w:after="180" w:line="300"/>
+      </w:pPr>
+      <w:r>
+        <w:rPr>
+          <w:color w:val="1E293B"/>
+          <w:sz w:val="21"/>
+          <w:szCs w:val="21"/>
+        </w:rPr>
+        <w:t xml:space="preserve">The most recent round of work focused on how the system looks and reads to the people who would actually use it — landlords, managers and tenants in Harare — rather than on new business rules. Each change was made additively, behind the existing tests, with its own new tests:</w:t>
+      </w:r>
+    </w:p>
+    <w:p>
+      <w:pPr>
+        <w:pStyle w:val="ListParagraph"/>
+        <w:numPr>
+          <w:ilvl w:val="0"/>
+          <w:numId w:val="2"/>
+        </w:numPr>
+        <w:spacing w:after="120" w:line="290"/>
+      </w:pPr>
+      <w:r>
+        <w:rPr>
+          <w:color w:val="1E293B"/>
+          <w:sz w:val="21"/>
+          <w:szCs w:val="21"/>
+        </w:rPr>
+        <w:t xml:space="preserve">Property map: every property can carry map coordinates, set by clicking a map on the Add/Edit Property forms. A property's detail page shows its pin, and a portfolio map (/properties/map) plots every located property with a popup linking back to it. Leaflet is vendored into the app rather than loaded from a CDN (8 tests).</w:t>
+      </w:r>
+    </w:p>
+    <w:p>
+      <w:pPr>
+        <w:pStyle w:val="ListParagraph"/>
+        <w:numPr>
+          <w:ilvl w:val="0"/>
+          <w:numId w:val="2"/>
+        </w:numPr>
+        <w:spacing w:after="120" w:line="290"/>
+      </w:pPr>
+      <w:r>
+        <w:rPr>
+          <w:color w:val="1E293B"/>
+          <w:sz w:val="21"/>
+          <w:szCs w:val="21"/>
+        </w:rPr>
+        <w:t xml:space="preserve">Redesigned interface: the sidebar was replaced by a horizontal top navigation bar with a soft blue-to-burgundy gradient. The login page is a full-screen photograph of the Harare skyline with a translucent sign-in card, and each section of the app has its own Harare photograph behind it — the skyline for the dashboard, reports and admin pages, an aerial view for properties, and a night street scene for tenants, rent, maintenance and the tenant portal. Cards and tables stay solid white and page titles are white with a soft shadow, so content stays readable.</w:t>
+      </w:r>
+    </w:p>
+    <w:p>
+      <w:pPr>
+        <w:pStyle w:val="ListParagraph"/>
+        <w:numPr>
+          <w:ilvl w:val="0"/>
+          <w:numId w:val="2"/>
+        </w:numPr>
+        <w:spacing w:after="120" w:line="290"/>
+      </w:pPr>
+      <w:r>
+        <w:rPr>
+          <w:color w:val="1E293B"/>
+          <w:sz w:val="21"/>
+          <w:szCs w:val="21"/>
+        </w:rPr>
+        <w:t xml:space="preserve">English/Shona language switch: an EN | SN toggle in the top bar and on the login page. A small built-in translator (backend/i18n.py) looks each interface phrase up in a Shona table and falls back to English for anything not yet translated. The choice is kept in the session and survives logging in and out. Navigation, login, the dashboards, the main list pages, the tenant portal and status badges are translated; data — property names, addresses, suburbs, cities and people's names — is never translated, and a test enforces that (9 tests).</w:t>
+      </w:r>
+    </w:p>
+    <w:p>
+      <w:pPr>
+        <w:pStyle w:val="ListParagraph"/>
+        <w:numPr>
+          <w:ilvl w:val="0"/>
+          <w:numId w:val="2"/>
+        </w:numPr>
+        <w:spacing w:after="120" w:line="290"/>
+      </w:pPr>
+      <w:r>
+        <w:rPr>
+          <w:color w:val="1E293B"/>
+          <w:sz w:val="21"/>
+          <w:szCs w:val="21"/>
+        </w:rPr>
+        <w:t xml:space="preserve">Tenant-friendly unit labels: the tenant dashboard and Pay Rent page name the property and unit (for example “Avondale Heights · Unit 101”) instead of an internal unit code (1 test).</w:t>
+      </w:r>
+    </w:p>
+    <w:p>
+      <w:pPr>
+        <w:pStyle w:val="ListParagraph"/>
+        <w:numPr>
+          <w:ilvl w:val="0"/>
+          <w:numId w:val="2"/>
+        </w:numPr>
+        <w:spacing w:after="120" w:line="290"/>
+      </w:pPr>
+      <w:r>
+        <w:rPr>
+          <w:color w:val="1E293B"/>
+          <w:sz w:val="21"/>
+          <w:szCs w:val="21"/>
+        </w:rPr>
+        <w:t xml:space="preserve">Logged-in redirect fix: opening the home page, the login page, or a password-reset or invitation link while already signed in used to show an empty page; it now takes the user to their own dashboard, portal or work queue (4 tests).</w:t>
+      </w:r>
+    </w:p>
+    <w:p>
+      <w:pPr>
+        <w:pStyle w:val="ListParagraph"/>
+        <w:numPr>
+          <w:ilvl w:val="0"/>
+          <w:numId w:val="2"/>
+        </w:numPr>
+        <w:spacing w:after="120" w:line="290"/>
+      </w:pPr>
+      <w:r>
+        <w:rPr>
+          <w:color w:val="1E293B"/>
+          <w:sz w:val="21"/>
+          <w:szCs w:val="21"/>
+        </w:rPr>
+        <w:t xml:space="preserve">Harare demonstration data: the seed data now describes a Harare portfolio — five properties in Avondale, the CBD, Eastlea and Vainona, each with map coordinates; 16 units; nine tenants with Zimbabwean names, national IDs and +263 phone numbers; a payment history for every lease with three tenants in arrears; and the administrator account in the author's name.</w:t>
+      </w:r>
+    </w:p>
+    <w:p>
+      <w:pPr>
+        <w:spacing w:after="180" w:line="300"/>
+      </w:pPr>
+      <w:r>
+        <w:rPr>
+          <w:color w:val="1E293B"/>
+          <w:sz w:val="21"/>
+          <w:szCs w:val="21"/>
+        </w:rPr>
+        <w:t xml:space="preserve">The SRS originally described multi-language support as Arabic and English. Because the system's intended users are in Harare, Shona — the most widely spoken language there — was implemented as the second language instead. The translation mechanism is language-neutral: adding another language, Arabic included, only needs a new phrase table. The Shona wording has not yet been reviewed by a native speaker.</w:t>
       </w:r>
     </w:p>
     <w:p>
@@ -1992,7 +2259,7 @@
                 <w:sz w:val="20"/>
                 <w:szCs w:val="20"/>
               </w:rPr>
-              <w:t xml:space="preserve">35 Jinja2 templates behind role-aware navigation, plus a shared design system in static/css/style.css</w:t>
+              <w:t xml:space="preserve">38 Jinja2 templates behind a role-aware top navigation bar with an English/Shona switch, plus a shared design system in static/css/style.css</w:t>
             </w:r>
           </w:p>
         </w:tc>
@@ -2104,7 +2371,7 @@
                 <w:sz w:val="20"/>
                 <w:szCs w:val="20"/>
               </w:rPr>
-              <w:t xml:space="preserve">security.py (RBAC, IDOR, validation, audit log), scheduler_jobs.py (5 background jobs), services/ (notifications, payments, pdf, excel, reports, storage)</w:t>
+              <w:t xml:space="preserve">security.py (RBAC, IDOR, validation, audit log), i18n.py (English/Shona translation), scheduler_jobs.py (5 background jobs), services/ (notifications, payments, pdf, excel, reports, storage)</w:t>
             </w:r>
           </w:p>
         </w:tc>
@@ -2691,6 +2958,37 @@
     </w:p>
     <w:p>
       <w:pPr>
+        <w:pStyle w:val="Heading2"/>
+        <w:spacing w:after="150" w:before="300"/>
+      </w:pPr>
+      <w:bookmarkStart w:id="931" w:name="_Toc90000031"/>
+      <w:r>
+        <w:rPr>
+          <w:b/>
+          <w:bCs/>
+          <w:color w:val="2563EB"/>
+          <w:sz w:val="26"/>
+          <w:szCs w:val="26"/>
+        </w:rPr>
+        <w:t xml:space="preserve">5.4 Usability &amp; Localisation Highlights</w:t>
+      </w:r>
+      <w:bookmarkEnd w:id="931"/>
+    </w:p>
+    <w:p>
+      <w:pPr>
+        <w:spacing w:after="180" w:line="300"/>
+      </w:pPr>
+      <w:r>
+        <w:rPr>
+          <w:color w:val="1E293B"/>
+          <w:sz w:val="21"/>
+          <w:szCs w:val="21"/>
+        </w:rPr>
+        <w:t xml:space="preserve">The usability and localisation work (Section 3.5) changed what every role sees rather than what the system can do: a map of the whole portfolio, a cleaner top-bar layout with Harare photography, and an English/Shona switch, so a Harare tenant can check a balance or pay rent in Shona. It sits on the same role-scoped routes described in Section 5.1, and demonstrating the system with a realistic Harare portfolio makes every dashboard, report and rent tracker figure meaningful.</w:t>
+      </w:r>
+    </w:p>
+    <w:p>
+      <w:pPr>
         <w:pStyle w:val="Heading1"/>
         <w:spacing w:after="200" w:before="400"/>
       </w:pPr>
@@ -2846,7 +3144,7 @@
                 <w:sz w:val="20"/>
                 <w:szCs w:val="20"/>
               </w:rPr>
-              <w:t xml:space="preserve">204</w:t>
+              <w:t xml:space="preserve">226</w:t>
             </w:r>
           </w:p>
         </w:tc>
@@ -2902,7 +3200,7 @@
                 <w:sz w:val="20"/>
                 <w:szCs w:val="20"/>
               </w:rPr>
-              <w:t xml:space="preserve">204</w:t>
+              <w:t xml:space="preserve">226</w:t>
             </w:r>
           </w:p>
         </w:tc>
@@ -3070,7 +3368,7 @@
                 <w:sz w:val="20"/>
                 <w:szCs w:val="20"/>
               </w:rPr>
-              <w:t xml:space="preserve">83%</w:t>
+              <w:t xml:space="preserve">82%</w:t>
             </w:r>
           </w:p>
         </w:tc>
@@ -3316,6 +3614,24 @@
     </w:p>
     <w:p>
       <w:pPr>
+        <w:pStyle w:val="ListParagraph"/>
+        <w:numPr>
+          <w:ilvl w:val="0"/>
+          <w:numId w:val="2"/>
+        </w:numPr>
+        <w:spacing w:after="120" w:line="290"/>
+      </w:pPr>
+      <w:r>
+        <w:rPr>
+          <w:color w:val="1E293B"/>
+          <w:sz w:val="21"/>
+          <w:szCs w:val="21"/>
+        </w:rPr>
+        <w:t xml:space="preserve">Usability &amp; localisation: the English/Shona switch (English by default, switching, the choice surviving login, no open redirect, placeholders kept, place names never translated), the property map, the logged-in redirect and the tenant unit labels — 22 tests.</w:t>
+      </w:r>
+    </w:p>
+    <w:p>
+      <w:pPr>
         <w:spacing w:after="180" w:line="300"/>
       </w:pPr>
       <w:r>
@@ -3324,7 +3640,7 @@
           <w:sz w:val="21"/>
           <w:szCs w:val="21"/>
         </w:rPr>
-        <w:t xml:space="preserve">Coverage is concentrated in models.py (99%), security.py (92%), and the reports service (95%) — the modules carrying the business rules this project cares most about proving correct. The lowest-coverage files are thin route handlers whose uncovered branches are error-message formatting, and seed.py (demo-data tooling, intentionally outside the suite’s scope).</w:t>
+        <w:t xml:space="preserve">Coverage is concentrated in models.py (99%), security.py (93%), and the reports service (95%) — the modules carrying the business rules this project cares most about proving correct. The lowest-coverage files are thin route handlers whose uncovered branches are error-message formatting, and seed.py (demo-data tooling, intentionally outside the suite’s scope).</w:t>
       </w:r>
     </w:p>
     <w:p>
@@ -3700,6 +4016,62 @@
           </w:p>
         </w:tc>
       </w:tr>
+      <w:tr>
+        <w:tc>
+          <w:tcPr>
+            <w:tcW w:type="dxa" w:w="3200"/>
+            <w:shd w:fill="FFFFFF" w:val="clear"/>
+            <w:tcMar>
+              <w:top w:type="dxa" w:w="100"/>
+              <w:left w:type="dxa" w:w="120"/>
+              <w:bottom w:type="dxa" w:w="100"/>
+              <w:right w:type="dxa" w:w="120"/>
+            </w:tcMar>
+          </w:tcPr>
+          <w:p>
+            <w:pPr>
+              <w:jc w:val="left"/>
+            </w:pPr>
+            <w:r>
+              <w:rPr>
+                <w:b w:val="false"/>
+                <w:bCs w:val="false"/>
+                <w:color w:val="1E293B"/>
+                <w:sz w:val="20"/>
+                <w:szCs w:val="20"/>
+              </w:rPr>
+              <w:t xml:space="preserve">Adding a second language late in the project, without a translation library and without translating the data by mistake</w:t>
+            </w:r>
+          </w:p>
+        </w:tc>
+        <w:tc>
+          <w:tcPr>
+            <w:tcW w:type="dxa" w:w="6960"/>
+            <w:shd w:fill="FFFFFF" w:val="clear"/>
+            <w:tcMar>
+              <w:top w:type="dxa" w:w="100"/>
+              <w:left w:type="dxa" w:w="120"/>
+              <w:bottom w:type="dxa" w:w="100"/>
+              <w:right w:type="dxa" w:w="120"/>
+            </w:tcMar>
+          </w:tcPr>
+          <w:p>
+            <w:pPr>
+              <w:jc w:val="left"/>
+            </w:pPr>
+            <w:r>
+              <w:rPr>
+                <w:b w:val="false"/>
+                <w:bCs w:val="false"/>
+                <w:color w:val="1E293B"/>
+                <w:sz w:val="20"/>
+                <w:szCs w:val="20"/>
+              </w:rPr>
+              <w:t xml:space="preserve">Wrapped only interface text in a small _() helper with an English fallback, so the app works at every stage of translation; kept names and places as plain data, and added a test that fails if a Harare place name is ever changed or given a Shona entry</w:t>
+            </w:r>
+          </w:p>
+        </w:tc>
+      </w:tr>
     </w:tbl>
     <w:p>
       <w:pPr>
@@ -3742,7 +4114,7 @@
           <w:sz w:val="21"/>
           <w:szCs w:val="21"/>
         </w:rPr>
-        <w:t xml:space="preserve">RentalPro was carried from a requirements document, through a design, to a working prototype, a full project report, 100% feature completion, a demonstration and presentation package, and now an extended billing engine. Every claim in this document is backed by a running, tested system: 25 of 25 use cases implemented, each with a route and a covering test; the original 13-table database design implemented exactly as specified, since grown to 18 tables; all 204 automated tests passing with zero failures at 83% statement coverage; eight additional feature gaps closed in Deliverable 5; and eight further billing capabilities added afterward. The application runs — and its test suite passes — using only Docker or a local Python virtual environment, with zero paid external accounts required.</w:t>
+        <w:t xml:space="preserve">RentalPro was carried from a requirements document, through a design, to a working prototype, a full project report, 100% feature completion, a demonstration and presentation package, an extended billing engine, and a localised, Harare-focused interface. Every claim in this document is backed by a running, tested system: 25 of 25 use cases implemented, each with a route and a covering test; the original 13-table database design implemented exactly as specified, since grown to 18 tables; all 226 automated tests passing with zero failures at 82% statement coverage; eight additional feature gaps closed in Deliverable 5; eight further billing capabilities added afterward; and an English/Shona interface with a property map and Harare demonstration data. The application runs — and its test suite passes — using only Docker or a local Python virtual environment, with zero paid external accounts required.</w:t>
       </w:r>
     </w:p>
     <w:p>
@@ -3873,6 +4245,34 @@
           <w:szCs w:val="21"/>
         </w:rPr>
         <w:t xml:space="preserve">end-to-end tests against real Stripe, SendGrid, and Twilio sandbox accounts, in addition to the existing offline test suite.</w:t>
+      </w:r>
+    </w:p>
+    <w:p>
+      <w:pPr>
+        <w:pStyle w:val="ListParagraph"/>
+        <w:numPr>
+          <w:ilvl w:val="0"/>
+          <w:numId w:val="2"/>
+        </w:numPr>
+        <w:spacing w:after="120" w:line="290"/>
+      </w:pPr>
+      <w:r>
+        <w:rPr>
+          <w:b/>
+          <w:bCs/>
+          <w:color w:val="1E293B"/>
+          <w:sz w:val="21"/>
+          <w:szCs w:val="21"/>
+        </w:rPr>
+        <w:t xml:space="preserve">Finish and review the Shona translation:</w:t>
+      </w:r>
+      <w:r>
+        <w:rPr>
+          <w:color w:val="1E293B"/>
+          <w:sz w:val="21"/>
+          <w:szCs w:val="21"/>
+        </w:rPr>
+        <w:t xml:space="preserve"> translate the remaining forms, detail pages and on-screen messages, and have the wording checked by a native Shona speaker.</w:t>
       </w:r>
     </w:p>
     <w:p>
@@ -4261,7 +4661,7 @@
                 <w:sz w:val="20"/>
                 <w:szCs w:val="20"/>
               </w:rPr>
-              <w:t xml:space="preserve">35</w:t>
+              <w:t xml:space="preserve">38</w:t>
             </w:r>
           </w:p>
         </w:tc>
@@ -4373,7 +4773,7 @@
                 <w:sz w:val="20"/>
                 <w:szCs w:val="20"/>
               </w:rPr>
-              <w:t xml:space="preserve">204</w:t>
+              <w:t xml:space="preserve">226</w:t>
             </w:r>
           </w:p>
         </w:tc>
@@ -4429,7 +4829,7 @@
                 <w:sz w:val="20"/>
                 <w:szCs w:val="20"/>
               </w:rPr>
-              <w:t xml:space="preserve">204</w:t>
+              <w:t xml:space="preserve">226</w:t>
             </w:r>
           </w:p>
         </w:tc>
@@ -4597,7 +4997,7 @@
                 <w:sz w:val="20"/>
                 <w:szCs w:val="20"/>
               </w:rPr>
-              <w:t xml:space="preserve">83%</w:t>
+              <w:t xml:space="preserve">82%</w:t>
             </w:r>
           </w:p>
         </w:tc>
@@ -4822,6 +5222,174 @@
                 <w:szCs w:val="20"/>
               </w:rPr>
               <w:t xml:space="preserve">78</w:t>
+            </w:r>
+          </w:p>
+        </w:tc>
+      </w:tr>
+      <w:tr>
+        <w:tc>
+          <w:tcPr>
+            <w:tcW w:type="dxa" w:w="5400"/>
+            <w:shd w:fill="FFFFFF" w:val="clear"/>
+            <w:tcMar>
+              <w:top w:type="dxa" w:w="100"/>
+              <w:left w:type="dxa" w:w="120"/>
+              <w:bottom w:type="dxa" w:w="100"/>
+              <w:right w:type="dxa" w:w="120"/>
+            </w:tcMar>
+          </w:tcPr>
+          <w:p>
+            <w:pPr>
+              <w:jc w:val="left"/>
+            </w:pPr>
+            <w:r>
+              <w:rPr>
+                <w:b w:val="false"/>
+                <w:bCs w:val="false"/>
+                <w:color w:val="1E293B"/>
+                <w:sz w:val="20"/>
+                <w:szCs w:val="20"/>
+              </w:rPr>
+              <w:t xml:space="preserve">Usability &amp; localisation dedicated tests</w:t>
+            </w:r>
+          </w:p>
+        </w:tc>
+        <w:tc>
+          <w:tcPr>
+            <w:tcW w:type="dxa" w:w="4760"/>
+            <w:shd w:fill="FFFFFF" w:val="clear"/>
+            <w:tcMar>
+              <w:top w:type="dxa" w:w="100"/>
+              <w:left w:type="dxa" w:w="120"/>
+              <w:bottom w:type="dxa" w:w="100"/>
+              <w:right w:type="dxa" w:w="120"/>
+            </w:tcMar>
+          </w:tcPr>
+          <w:p>
+            <w:pPr>
+              <w:jc w:val="left"/>
+            </w:pPr>
+            <w:r>
+              <w:rPr>
+                <w:b w:val="false"/>
+                <w:bCs w:val="false"/>
+                <w:color w:val="1E293B"/>
+                <w:sz w:val="20"/>
+                <w:szCs w:val="20"/>
+              </w:rPr>
+              <w:t xml:space="preserve">22</w:t>
+            </w:r>
+          </w:p>
+        </w:tc>
+      </w:tr>
+      <w:tr>
+        <w:tc>
+          <w:tcPr>
+            <w:tcW w:type="dxa" w:w="5400"/>
+            <w:shd w:fill="FFFFFF" w:val="clear"/>
+            <w:tcMar>
+              <w:top w:type="dxa" w:w="100"/>
+              <w:left w:type="dxa" w:w="120"/>
+              <w:bottom w:type="dxa" w:w="100"/>
+              <w:right w:type="dxa" w:w="120"/>
+            </w:tcMar>
+          </w:tcPr>
+          <w:p>
+            <w:pPr>
+              <w:jc w:val="left"/>
+            </w:pPr>
+            <w:r>
+              <w:rPr>
+                <w:b w:val="false"/>
+                <w:bCs w:val="false"/>
+                <w:color w:val="1E293B"/>
+                <w:sz w:val="20"/>
+                <w:szCs w:val="20"/>
+              </w:rPr>
+              <w:t xml:space="preserve">Interface languages</w:t>
+            </w:r>
+          </w:p>
+        </w:tc>
+        <w:tc>
+          <w:tcPr>
+            <w:tcW w:type="dxa" w:w="4760"/>
+            <w:shd w:fill="FFFFFF" w:val="clear"/>
+            <w:tcMar>
+              <w:top w:type="dxa" w:w="100"/>
+              <w:left w:type="dxa" w:w="120"/>
+              <w:bottom w:type="dxa" w:w="100"/>
+              <w:right w:type="dxa" w:w="120"/>
+            </w:tcMar>
+          </w:tcPr>
+          <w:p>
+            <w:pPr>
+              <w:jc w:val="left"/>
+            </w:pPr>
+            <w:r>
+              <w:rPr>
+                <w:b w:val="false"/>
+                <w:bCs w:val="false"/>
+                <w:color w:val="1E293B"/>
+                <w:sz w:val="20"/>
+                <w:szCs w:val="20"/>
+              </w:rPr>
+              <w:t xml:space="preserve">2 (English, Shona)</w:t>
+            </w:r>
+          </w:p>
+        </w:tc>
+      </w:tr>
+      <w:tr>
+        <w:tc>
+          <w:tcPr>
+            <w:tcW w:type="dxa" w:w="5400"/>
+            <w:shd w:fill="FFFFFF" w:val="clear"/>
+            <w:tcMar>
+              <w:top w:type="dxa" w:w="100"/>
+              <w:left w:type="dxa" w:w="120"/>
+              <w:bottom w:type="dxa" w:w="100"/>
+              <w:right w:type="dxa" w:w="120"/>
+            </w:tcMar>
+          </w:tcPr>
+          <w:p>
+            <w:pPr>
+              <w:jc w:val="left"/>
+            </w:pPr>
+            <w:r>
+              <w:rPr>
+                <w:b w:val="false"/>
+                <w:bCs w:val="false"/>
+                <w:color w:val="1E293B"/>
+                <w:sz w:val="20"/>
+                <w:szCs w:val="20"/>
+              </w:rPr>
+              <w:t xml:space="preserve">Demo portfolio</w:t>
+            </w:r>
+          </w:p>
+        </w:tc>
+        <w:tc>
+          <w:tcPr>
+            <w:tcW w:type="dxa" w:w="4760"/>
+            <w:shd w:fill="FFFFFF" w:val="clear"/>
+            <w:tcMar>
+              <w:top w:type="dxa" w:w="100"/>
+              <w:left w:type="dxa" w:w="120"/>
+              <w:bottom w:type="dxa" w:w="100"/>
+              <w:right w:type="dxa" w:w="120"/>
+            </w:tcMar>
+          </w:tcPr>
+          <w:p>
+            <w:pPr>
+              <w:jc w:val="left"/>
+            </w:pPr>
+            <w:r>
+              <w:rPr>
+                <w:b w:val="false"/>
+                <w:bCs w:val="false"/>
+                <w:color w:val="1E293B"/>
+                <w:sz w:val="20"/>
+                <w:szCs w:val="20"/>
+              </w:rPr>
+              <w:t xml:space="preserve">5 Harare properties, 16 units, 9 tenants</w:t>
             </w:r>
           </w:p>
         </w:tc>

</xml_diff>